<commit_message>
Update data, figures, and summaries
</commit_message>
<xml_diff>
--- a/7_figures/output/figure1/Figure1.docx
+++ b/7_figures/output/figure1/Figure1.docx
@@ -204,7 +204,7 @@
       </w:tr>
       <w:tr>
         <w:trPr>
-          <w:trHeight w:val="776" w:hRule="auto"/>
+          <w:trHeight w:val="777" w:hRule="auto"/>
         </w:trPr>
         body1
         <w:tc>
@@ -383,7 +383,7 @@
                 <w:szCs w:val="20"/>
                 <w:color w:val="000000"/>
               </w:rPr>
-              <w:t xml:space="preserve">0.367</w:t>
+              <w:t xml:space="preserve">0.368</w:t>
             </w:r>
             <w:r>
               <w:rPr>
@@ -517,7 +517,7 @@
                 <w:szCs w:val="20"/>
                 <w:color w:val="000000"/>
               </w:rPr>
-              <w:t xml:space="preserve">0.848</w:t>
+              <w:t xml:space="preserve">0.882</w:t>
             </w:r>
             <w:r>
               <w:rPr>
@@ -593,7 +593,7 @@
                 <w:szCs w:val="20"/>
                 <w:color w:val="000000"/>
               </w:rPr>
-              <w:t xml:space="preserve">0.728</w:t>
+              <w:t xml:space="preserve">0.748</w:t>
             </w:r>
             <w:r>
               <w:rPr>
@@ -617,7 +617,7 @@
                 <w:szCs w:val="20"/>
                 <w:color w:val="000000"/>
               </w:rPr>
-              <w:t xml:space="preserve">(SE = 0.017)</w:t>
+              <w:t xml:space="preserve">(SE = 0.018)</w:t>
             </w:r>
           </w:p>
         </w:tc>

</xml_diff>